<commit_message>
Ostatni rozbory a uprava
</commit_message>
<xml_diff>
--- a/FinalniSeznam.docx
+++ b/FinalniSeznam.docx
@@ -1064,7 +1064,7 @@
                 <w:szCs w:val="24"/>
                 <w:rtl w:val="0"/>
               </w:rPr>
-              <w:t xml:space="preserve">Petr a Lucie</w:t>
+              <w:t xml:space="preserve">Epos o Gilgamešovi – překlad Lubor Matouš</w:t>
             </w:r>
             <w:r>
               <w:rPr>
@@ -1190,7 +1190,7 @@
                 <w:szCs w:val="24"/>
                 <w:rtl w:val="0"/>
               </w:rPr>
-              <w:t xml:space="preserve">Revizor</w:t>
+              <w:t xml:space="preserve">Euripides – Médea – překlad Ferdinand Stiebitz</w:t>
             </w:r>
             <w:r>
               <w:rPr>
@@ -1316,7 +1316,7 @@
                 <w:szCs w:val="24"/>
                 <w:rtl w:val="0"/>
               </w:rPr>
-              <w:t xml:space="preserve">Farma zvířat</w:t>
+              <w:t xml:space="preserve">Nikolaj Vasiljevič Gogol – Revizor – překlad Karel Milota</w:t>
             </w:r>
             <w:r>
               <w:rPr>
@@ -1442,7 +1442,7 @@
                 <w:szCs w:val="24"/>
                 <w:rtl w:val="0"/>
               </w:rPr>
-              <w:t xml:space="preserve">Malý princ</w:t>
+              <w:t xml:space="preserve">Karel Hynek Mácha – Máj</w:t>
             </w:r>
             <w:r>
               <w:rPr>
@@ -1532,48 +1532,21 @@
           </w:tcPr>
           <w:p>
             <w:pPr>
-              <w:keepNext w:val="0"/>
-              <w:keepLines w:val="0"/>
-              <w:pageBreakBefore w:val="0"/>
-              <w:widowControl w:val="0"/>
-              <w:pBdr>
-                <w:top w:space="0" w:sz="0" w:val="nil"/>
-                <w:left w:space="0" w:sz="0" w:val="nil"/>
-                <w:bottom w:space="0" w:sz="0" w:val="nil"/>
-                <w:right w:space="0" w:sz="0" w:val="nil"/>
-                <w:between w:space="0" w:sz="0" w:val="nil"/>
-              </w:pBdr>
-              <w:shd w:fill="auto" w:val="clear"/>
-              <w:spacing w:after="0" w:before="0" w:line="240" w:lineRule="auto"/>
-              <w:ind w:left="0" w:right="0" w:firstLine="0"/>
-              <w:jc w:val="left"/>
-              <w:rPr>
-                <w:rFonts w:ascii="Arial" w:cs="Arial" w:eastAsia="Arial" w:hAnsi="Arial"/>
-                <w:i w:val="0"/>
-                <w:iCs w:val="0"/>
-                <w:smallCaps w:val="0"/>
-                <w:strike w:val="0"/>
-                <w:color w:val="000000"/>
-                <w:sz w:val="24"/>
-                <w:szCs w:val="24"/>
-                <w:u w:val="none"/>
-                <w:shd w:fill="auto" w:val="clear"/>
-                <w:vertAlign w:val="baseline"/>
-              </w:rPr>
-            </w:pPr>
-            <w:r>
-              <w:rPr>
-                <w:rFonts w:ascii="Arial" w:cs="Arial" w:eastAsia="Arial" w:hAnsi="Arial"/>
-                <w:sz w:val="24"/>
-                <w:szCs w:val="24"/>
-                <w:rtl w:val="0"/>
-              </w:rPr>
-              <w:t xml:space="preserve">Bílá nemoc</w:t>
-            </w:r>
-            <w:r>
-              <w:rPr>
-                <w:rtl w:val="0"/>
-              </w:rPr>
+              <w:widowControl w:val="0"/>
+              <w:rPr>
+                <w:rFonts w:ascii="Arial" w:cs="Arial" w:eastAsia="Arial" w:hAnsi="Arial"/>
+                <w:sz w:val="24"/>
+                <w:szCs w:val="24"/>
+              </w:rPr>
+            </w:pPr>
+            <w:r>
+              <w:rPr>
+                <w:rFonts w:ascii="Arial" w:cs="Arial" w:eastAsia="Arial" w:hAnsi="Arial"/>
+                <w:sz w:val="24"/>
+                <w:szCs w:val="24"/>
+                <w:rtl w:val="0"/>
+              </w:rPr>
+              <w:t xml:space="preserve">Karel Havlíček Borovský – Král Lávra</w:t>
             </w:r>
           </w:p>
         </w:tc>
@@ -1694,7 +1667,7 @@
                 <w:szCs w:val="24"/>
                 <w:rtl w:val="0"/>
               </w:rPr>
-              <w:t xml:space="preserve">Smrt krásných srnců</w:t>
+              <w:t xml:space="preserve">Karel Jaromír Erben – Kytice</w:t>
             </w:r>
             <w:r>
               <w:rPr>
@@ -1820,7 +1793,7 @@
                 <w:szCs w:val="24"/>
                 <w:rtl w:val="0"/>
               </w:rPr>
-              <w:t xml:space="preserve">Balady a romance</w:t>
+              <w:t xml:space="preserve">Božena Němcová – Divá Bára</w:t>
             </w:r>
             <w:r>
               <w:rPr>
@@ -1946,7 +1919,7 @@
                 <w:szCs w:val="24"/>
                 <w:rtl w:val="0"/>
               </w:rPr>
-              <w:t xml:space="preserve">Čekání na Godota</w:t>
+              <w:t xml:space="preserve">Jan Neruda – Povídky malostranské</w:t>
             </w:r>
             <w:r>
               <w:rPr>
@@ -2072,7 +2045,7 @@
                 <w:szCs w:val="24"/>
                 <w:rtl w:val="0"/>
               </w:rPr>
-              <w:t xml:space="preserve">Kytice</w:t>
+              <w:t xml:space="preserve">Jan Neruda – Balady a romance</w:t>
             </w:r>
             <w:r>
               <w:rPr>
@@ -2198,7 +2171,7 @@
                 <w:szCs w:val="24"/>
                 <w:rtl w:val="0"/>
               </w:rPr>
-              <w:t xml:space="preserve">Král Lávra</w:t>
+              <w:t xml:space="preserve">Franz Kafka – Proces – překlad D. a P. Eisnerovi</w:t>
             </w:r>
             <w:r>
               <w:rPr>
@@ -2324,7 +2297,7 @@
                 <w:szCs w:val="24"/>
                 <w:rtl w:val="0"/>
               </w:rPr>
-              <w:t xml:space="preserve">Máj</w:t>
+              <w:t xml:space="preserve">Franz Kafka – Proměna – překlad Zbyněk Sekal</w:t>
             </w:r>
             <w:r>
               <w:rPr>
@@ -2450,7 +2423,7 @@
                 <w:szCs w:val="24"/>
                 <w:rtl w:val="0"/>
               </w:rPr>
-              <w:t xml:space="preserve">Epos o gilgamešovi</w:t>
+              <w:t xml:space="preserve">Romain Rolland – Petr a Lucie – překlad Jaroslav Zaorálek</w:t>
             </w:r>
             <w:r>
               <w:rPr>
@@ -2576,7 +2549,7 @@
                 <w:szCs w:val="24"/>
                 <w:rtl w:val="0"/>
               </w:rPr>
-              <w:t xml:space="preserve">Proces</w:t>
+              <w:t xml:space="preserve">Antoine de Saint-Exupéry – Malý princ – překlad Richard Podaný</w:t>
             </w:r>
             <w:r>
               <w:rPr>
@@ -2702,7 +2675,7 @@
                 <w:szCs w:val="24"/>
                 <w:rtl w:val="0"/>
               </w:rPr>
-              <w:t xml:space="preserve">Proměna</w:t>
+              <w:t xml:space="preserve">John Steinbeck – O myších a lidech – překlad Vladimír Vendyš</w:t>
             </w:r>
             <w:r>
               <w:rPr>
@@ -2828,7 +2801,7 @@
                 <w:szCs w:val="24"/>
                 <w:rtl w:val="0"/>
               </w:rPr>
-              <w:t xml:space="preserve">Velký Gatsby</w:t>
+              <w:t xml:space="preserve">Francis Scott Fitzgerald – Velký Gatsby – překlad Martin Pokorný</w:t>
             </w:r>
             <w:r>
               <w:rPr>
@@ -2954,7 +2927,7 @@
                 <w:szCs w:val="24"/>
                 <w:rtl w:val="0"/>
               </w:rPr>
-              <w:t xml:space="preserve">Médea</w:t>
+              <w:t xml:space="preserve">George Orwell – Farma zvířat – překlad Gabriel Gössel</w:t>
             </w:r>
             <w:r>
               <w:rPr>
@@ -3080,7 +3053,7 @@
                 <w:szCs w:val="24"/>
                 <w:rtl w:val="0"/>
               </w:rPr>
-              <w:t xml:space="preserve">Spalovač mrtvol</w:t>
+              <w:t xml:space="preserve">Samuel Beckett – Čekání na Godota – překlad Karel Kraus</w:t>
             </w:r>
             <w:r>
               <w:rPr>
@@ -3206,7 +3179,7 @@
                 <w:szCs w:val="24"/>
                 <w:rtl w:val="0"/>
               </w:rPr>
-              <w:t xml:space="preserve">O myších a lidech</w:t>
+              <w:t xml:space="preserve">Karel Čapek – Bílá nemoc</w:t>
             </w:r>
             <w:r>
               <w:rPr>
@@ -3332,7 +3305,7 @@
                 <w:szCs w:val="24"/>
                 <w:rtl w:val="0"/>
               </w:rPr>
-              <w:t xml:space="preserve">Divá bára</w:t>
+              <w:t xml:space="preserve">Ota Pavel – Smrt krásných srnců</w:t>
             </w:r>
             <w:r>
               <w:rPr>
@@ -3456,7 +3429,7 @@
                 <w:szCs w:val="24"/>
                 <w:rtl w:val="0"/>
               </w:rPr>
-              <w:t xml:space="preserve">Povídky malostranské</w:t>
+              <w:t xml:space="preserve">Ladislav Fuks – Spalovač mrtvol</w:t>
             </w:r>
             <w:r>
               <w:rPr>

</xml_diff>

<commit_message>
Uprava seznamu u me a odebrani ostatnich
</commit_message>
<xml_diff>
--- a/FinalniSeznam.docx
+++ b/FinalniSeznam.docx
@@ -55,7 +55,7 @@
           <wp:inline distB="0" distT="0" distL="114300" distR="114300">
             <wp:extent cx="6665595" cy="1141730"/>
             <wp:effectExtent b="0" l="0" r="0" t="0"/>
-            <wp:docPr id="1026" name="image1.jpg"/>
+            <wp:docPr id="1" name="image1.jpg"/>
             <a:graphic>
               <a:graphicData uri="http://schemas.openxmlformats.org/drawingml/2006/picture">
                 <pic:pic>
@@ -64,7 +64,7 @@
                     <pic:cNvPicPr preferRelativeResize="0"/>
                   </pic:nvPicPr>
                   <pic:blipFill>
-                    <a:blip r:embed="rId7"/>
+                    <a:blip r:embed="rId6"/>
                     <a:srcRect b="0" l="0" r="0" t="0"/>
                     <a:stretch>
                       <a:fillRect/>
@@ -421,7 +421,6 @@
             <w:pPr>
               <w:keepNext w:val="0"/>
               <w:keepLines w:val="0"/>
-              <w:pageBreakBefore w:val="0"/>
               <w:widowControl w:val="0"/>
               <w:pBdr>
                 <w:top w:space="0" w:sz="0" w:val="nil"/>
@@ -478,7 +477,6 @@
             <w:pPr>
               <w:keepNext w:val="0"/>
               <w:keepLines w:val="0"/>
-              <w:pageBreakBefore w:val="0"/>
               <w:widowControl w:val="0"/>
               <w:pBdr>
                 <w:top w:space="0" w:sz="0" w:val="nil"/>
@@ -539,7 +537,6 @@
             <w:pPr>
               <w:keepNext w:val="0"/>
               <w:keepLines w:val="0"/>
-              <w:pageBreakBefore w:val="0"/>
               <w:widowControl w:val="0"/>
               <w:pBdr>
                 <w:top w:space="0" w:sz="0" w:val="nil"/>
@@ -600,7 +597,6 @@
             <w:pPr>
               <w:keepNext w:val="0"/>
               <w:keepLines w:val="0"/>
-              <w:pageBreakBefore w:val="0"/>
               <w:widowControl w:val="0"/>
               <w:pBdr>
                 <w:top w:space="0" w:sz="0" w:val="nil"/>
@@ -661,7 +657,6 @@
             <w:pPr>
               <w:keepNext w:val="0"/>
               <w:keepLines w:val="0"/>
-              <w:pageBreakBefore w:val="0"/>
               <w:widowControl w:val="0"/>
               <w:pBdr>
                 <w:top w:space="0" w:sz="0" w:val="nil"/>
@@ -722,7 +717,6 @@
             <w:pPr>
               <w:keepNext w:val="0"/>
               <w:keepLines w:val="0"/>
-              <w:pageBreakBefore w:val="0"/>
               <w:widowControl w:val="0"/>
               <w:pBdr>
                 <w:top w:space="0" w:sz="0" w:val="nil"/>
@@ -968,7 +962,6 @@
             <w:pPr>
               <w:keepNext w:val="0"/>
               <w:keepLines w:val="0"/>
-              <w:pageBreakBefore w:val="0"/>
               <w:widowControl w:val="0"/>
               <w:pBdr>
                 <w:top w:space="0" w:sz="0" w:val="nil"/>
@@ -1030,7 +1023,6 @@
             <w:pPr>
               <w:keepNext w:val="0"/>
               <w:keepLines w:val="0"/>
-              <w:pageBreakBefore w:val="0"/>
               <w:widowControl w:val="0"/>
               <w:pBdr>
                 <w:top w:space="0" w:sz="0" w:val="nil"/>
@@ -1093,7 +1085,6 @@
             <w:pPr>
               <w:keepNext w:val="0"/>
               <w:keepLines w:val="0"/>
-              <w:pageBreakBefore w:val="0"/>
               <w:widowControl w:val="0"/>
               <w:pBdr>
                 <w:top w:space="0" w:sz="0" w:val="nil"/>
@@ -1156,7 +1147,6 @@
             <w:pPr>
               <w:keepNext w:val="0"/>
               <w:keepLines w:val="0"/>
-              <w:pageBreakBefore w:val="0"/>
               <w:widowControl w:val="0"/>
               <w:pBdr>
                 <w:top w:space="0" w:sz="0" w:val="nil"/>
@@ -1219,7 +1209,6 @@
             <w:pPr>
               <w:keepNext w:val="0"/>
               <w:keepLines w:val="0"/>
-              <w:pageBreakBefore w:val="0"/>
               <w:widowControl w:val="0"/>
               <w:pBdr>
                 <w:top w:space="0" w:sz="0" w:val="nil"/>
@@ -1282,7 +1271,6 @@
             <w:pPr>
               <w:keepNext w:val="0"/>
               <w:keepLines w:val="0"/>
-              <w:pageBreakBefore w:val="0"/>
               <w:widowControl w:val="0"/>
               <w:pBdr>
                 <w:top w:space="0" w:sz="0" w:val="nil"/>
@@ -1345,7 +1333,6 @@
             <w:pPr>
               <w:keepNext w:val="0"/>
               <w:keepLines w:val="0"/>
-              <w:pageBreakBefore w:val="0"/>
               <w:widowControl w:val="0"/>
               <w:pBdr>
                 <w:top w:space="0" w:sz="0" w:val="nil"/>
@@ -1408,7 +1395,6 @@
             <w:pPr>
               <w:keepNext w:val="0"/>
               <w:keepLines w:val="0"/>
-              <w:pageBreakBefore w:val="0"/>
               <w:widowControl w:val="0"/>
               <w:pBdr>
                 <w:top w:space="0" w:sz="0" w:val="nil"/>
@@ -1471,7 +1457,6 @@
             <w:pPr>
               <w:keepNext w:val="0"/>
               <w:keepLines w:val="0"/>
-              <w:pageBreakBefore w:val="0"/>
               <w:widowControl w:val="0"/>
               <w:pBdr>
                 <w:top w:space="0" w:sz="0" w:val="nil"/>
@@ -1570,7 +1555,6 @@
             <w:pPr>
               <w:keepNext w:val="0"/>
               <w:keepLines w:val="0"/>
-              <w:pageBreakBefore w:val="0"/>
               <w:widowControl w:val="0"/>
               <w:pBdr>
                 <w:top w:space="0" w:sz="0" w:val="nil"/>
@@ -1633,7 +1617,6 @@
             <w:pPr>
               <w:keepNext w:val="0"/>
               <w:keepLines w:val="0"/>
-              <w:pageBreakBefore w:val="0"/>
               <w:widowControl w:val="0"/>
               <w:pBdr>
                 <w:top w:space="0" w:sz="0" w:val="nil"/>
@@ -1696,7 +1679,6 @@
             <w:pPr>
               <w:keepNext w:val="0"/>
               <w:keepLines w:val="0"/>
-              <w:pageBreakBefore w:val="0"/>
               <w:widowControl w:val="0"/>
               <w:pBdr>
                 <w:top w:space="0" w:sz="0" w:val="nil"/>
@@ -1759,7 +1741,6 @@
             <w:pPr>
               <w:keepNext w:val="0"/>
               <w:keepLines w:val="0"/>
-              <w:pageBreakBefore w:val="0"/>
               <w:widowControl w:val="0"/>
               <w:pBdr>
                 <w:top w:space="0" w:sz="0" w:val="nil"/>
@@ -1822,7 +1803,6 @@
             <w:pPr>
               <w:keepNext w:val="0"/>
               <w:keepLines w:val="0"/>
-              <w:pageBreakBefore w:val="0"/>
               <w:widowControl w:val="0"/>
               <w:pBdr>
                 <w:top w:space="0" w:sz="0" w:val="nil"/>
@@ -1883,48 +1863,20 @@
           </w:tcPr>
           <w:p>
             <w:pPr>
-              <w:keepNext w:val="0"/>
-              <w:keepLines w:val="0"/>
-              <w:pageBreakBefore w:val="0"/>
-              <w:widowControl w:val="0"/>
-              <w:pBdr>
-                <w:top w:space="0" w:sz="0" w:val="nil"/>
-                <w:left w:space="0" w:sz="0" w:val="nil"/>
-                <w:bottom w:space="0" w:sz="0" w:val="nil"/>
-                <w:right w:space="0" w:sz="0" w:val="nil"/>
-                <w:between w:space="0" w:sz="0" w:val="nil"/>
-              </w:pBdr>
-              <w:shd w:fill="auto" w:val="clear"/>
-              <w:spacing w:after="0" w:before="0" w:line="240" w:lineRule="auto"/>
-              <w:ind w:left="0" w:right="0" w:firstLine="0"/>
-              <w:jc w:val="left"/>
-              <w:rPr>
-                <w:rFonts w:ascii="Arial" w:cs="Arial" w:eastAsia="Arial" w:hAnsi="Arial"/>
-                <w:i w:val="0"/>
-                <w:iCs w:val="0"/>
-                <w:smallCaps w:val="0"/>
-                <w:strike w:val="0"/>
-                <w:color w:val="000000"/>
-                <w:sz w:val="24"/>
-                <w:szCs w:val="24"/>
-                <w:u w:val="none"/>
-                <w:shd w:fill="auto" w:val="clear"/>
-                <w:vertAlign w:val="baseline"/>
-              </w:rPr>
-            </w:pPr>
-            <w:r>
-              <w:rPr>
-                <w:rFonts w:ascii="Arial" w:cs="Arial" w:eastAsia="Arial" w:hAnsi="Arial"/>
-                <w:sz w:val="24"/>
-                <w:szCs w:val="24"/>
-                <w:rtl w:val="0"/>
-              </w:rPr>
-              <w:t xml:space="preserve">Jan Neruda – Povídky malostranské</w:t>
-            </w:r>
-            <w:r>
-              <w:rPr>
-                <w:rtl w:val="0"/>
-              </w:rPr>
+              <w:rPr>
+                <w:rFonts w:ascii="Arial" w:cs="Arial" w:eastAsia="Arial" w:hAnsi="Arial"/>
+                <w:sz w:val="24"/>
+                <w:szCs w:val="24"/>
+              </w:rPr>
+            </w:pPr>
+            <w:r>
+              <w:rPr>
+                <w:rFonts w:ascii="Arial" w:cs="Arial" w:eastAsia="Arial" w:hAnsi="Arial"/>
+                <w:sz w:val="24"/>
+                <w:szCs w:val="24"/>
+                <w:rtl w:val="0"/>
+              </w:rPr>
+              <w:t xml:space="preserve">Jan Neruda – Balady a romance</w:t>
             </w:r>
           </w:p>
         </w:tc>
@@ -1948,7 +1900,6 @@
             <w:pPr>
               <w:keepNext w:val="0"/>
               <w:keepLines w:val="0"/>
-              <w:pageBreakBefore w:val="0"/>
               <w:widowControl w:val="0"/>
               <w:pBdr>
                 <w:top w:space="0" w:sz="0" w:val="nil"/>
@@ -2009,48 +1960,20 @@
           </w:tcPr>
           <w:p>
             <w:pPr>
-              <w:keepNext w:val="0"/>
-              <w:keepLines w:val="0"/>
-              <w:pageBreakBefore w:val="0"/>
-              <w:widowControl w:val="0"/>
-              <w:pBdr>
-                <w:top w:space="0" w:sz="0" w:val="nil"/>
-                <w:left w:space="0" w:sz="0" w:val="nil"/>
-                <w:bottom w:space="0" w:sz="0" w:val="nil"/>
-                <w:right w:space="0" w:sz="0" w:val="nil"/>
-                <w:between w:space="0" w:sz="0" w:val="nil"/>
-              </w:pBdr>
-              <w:shd w:fill="auto" w:val="clear"/>
-              <w:spacing w:after="0" w:before="0" w:line="240" w:lineRule="auto"/>
-              <w:ind w:left="0" w:right="0" w:firstLine="0"/>
-              <w:jc w:val="left"/>
-              <w:rPr>
-                <w:rFonts w:ascii="Arial" w:cs="Arial" w:eastAsia="Arial" w:hAnsi="Arial"/>
-                <w:i w:val="0"/>
-                <w:iCs w:val="0"/>
-                <w:smallCaps w:val="0"/>
-                <w:strike w:val="0"/>
-                <w:color w:val="000000"/>
-                <w:sz w:val="24"/>
-                <w:szCs w:val="24"/>
-                <w:u w:val="none"/>
-                <w:shd w:fill="auto" w:val="clear"/>
-                <w:vertAlign w:val="baseline"/>
-              </w:rPr>
-            </w:pPr>
-            <w:r>
-              <w:rPr>
-                <w:rFonts w:ascii="Arial" w:cs="Arial" w:eastAsia="Arial" w:hAnsi="Arial"/>
-                <w:sz w:val="24"/>
-                <w:szCs w:val="24"/>
-                <w:rtl w:val="0"/>
-              </w:rPr>
-              <w:t xml:space="preserve">Jan Neruda – Balady a romance</w:t>
-            </w:r>
-            <w:r>
-              <w:rPr>
-                <w:rtl w:val="0"/>
-              </w:rPr>
+              <w:rPr>
+                <w:rFonts w:ascii="Arial" w:cs="Arial" w:eastAsia="Arial" w:hAnsi="Arial"/>
+                <w:sz w:val="24"/>
+                <w:szCs w:val="24"/>
+              </w:rPr>
+            </w:pPr>
+            <w:r>
+              <w:rPr>
+                <w:rFonts w:ascii="Arial" w:cs="Arial" w:eastAsia="Arial" w:hAnsi="Arial"/>
+                <w:sz w:val="24"/>
+                <w:szCs w:val="24"/>
+                <w:rtl w:val="0"/>
+              </w:rPr>
+              <w:t xml:space="preserve">Franz Kafka – Proces – překlad D. a P. Eisnerovi</w:t>
             </w:r>
           </w:p>
         </w:tc>
@@ -2074,7 +1997,6 @@
             <w:pPr>
               <w:keepNext w:val="0"/>
               <w:keepLines w:val="0"/>
-              <w:pageBreakBefore w:val="0"/>
               <w:widowControl w:val="0"/>
               <w:pBdr>
                 <w:top w:space="0" w:sz="0" w:val="nil"/>
@@ -2135,48 +2057,20 @@
           </w:tcPr>
           <w:p>
             <w:pPr>
-              <w:keepNext w:val="0"/>
-              <w:keepLines w:val="0"/>
-              <w:pageBreakBefore w:val="0"/>
-              <w:widowControl w:val="0"/>
-              <w:pBdr>
-                <w:top w:space="0" w:sz="0" w:val="nil"/>
-                <w:left w:space="0" w:sz="0" w:val="nil"/>
-                <w:bottom w:space="0" w:sz="0" w:val="nil"/>
-                <w:right w:space="0" w:sz="0" w:val="nil"/>
-                <w:between w:space="0" w:sz="0" w:val="nil"/>
-              </w:pBdr>
-              <w:shd w:fill="auto" w:val="clear"/>
-              <w:spacing w:after="0" w:before="0" w:line="240" w:lineRule="auto"/>
-              <w:ind w:left="0" w:right="0" w:firstLine="0"/>
-              <w:jc w:val="left"/>
-              <w:rPr>
-                <w:rFonts w:ascii="Arial" w:cs="Arial" w:eastAsia="Arial" w:hAnsi="Arial"/>
-                <w:i w:val="0"/>
-                <w:iCs w:val="0"/>
-                <w:smallCaps w:val="0"/>
-                <w:strike w:val="0"/>
-                <w:color w:val="000000"/>
-                <w:sz w:val="24"/>
-                <w:szCs w:val="24"/>
-                <w:u w:val="none"/>
-                <w:shd w:fill="auto" w:val="clear"/>
-                <w:vertAlign w:val="baseline"/>
-              </w:rPr>
-            </w:pPr>
-            <w:r>
-              <w:rPr>
-                <w:rFonts w:ascii="Arial" w:cs="Arial" w:eastAsia="Arial" w:hAnsi="Arial"/>
-                <w:sz w:val="24"/>
-                <w:szCs w:val="24"/>
-                <w:rtl w:val="0"/>
-              </w:rPr>
-              <w:t xml:space="preserve">Franz Kafka – Proces – překlad D. a P. Eisnerovi</w:t>
-            </w:r>
-            <w:r>
-              <w:rPr>
-                <w:rtl w:val="0"/>
-              </w:rPr>
+              <w:rPr>
+                <w:rFonts w:ascii="Arial" w:cs="Arial" w:eastAsia="Arial" w:hAnsi="Arial"/>
+                <w:sz w:val="24"/>
+                <w:szCs w:val="24"/>
+              </w:rPr>
+            </w:pPr>
+            <w:r>
+              <w:rPr>
+                <w:rFonts w:ascii="Arial" w:cs="Arial" w:eastAsia="Arial" w:hAnsi="Arial"/>
+                <w:sz w:val="24"/>
+                <w:szCs w:val="24"/>
+                <w:rtl w:val="0"/>
+              </w:rPr>
+              <w:t xml:space="preserve">Franz Kafka – Proměna – překlad Zbyněk Sekal</w:t>
             </w:r>
           </w:p>
         </w:tc>
@@ -2200,7 +2094,6 @@
             <w:pPr>
               <w:keepNext w:val="0"/>
               <w:keepLines w:val="0"/>
-              <w:pageBreakBefore w:val="0"/>
               <w:widowControl w:val="0"/>
               <w:pBdr>
                 <w:top w:space="0" w:sz="0" w:val="nil"/>
@@ -2261,48 +2154,20 @@
           </w:tcPr>
           <w:p>
             <w:pPr>
-              <w:keepNext w:val="0"/>
-              <w:keepLines w:val="0"/>
-              <w:pageBreakBefore w:val="0"/>
-              <w:widowControl w:val="0"/>
-              <w:pBdr>
-                <w:top w:space="0" w:sz="0" w:val="nil"/>
-                <w:left w:space="0" w:sz="0" w:val="nil"/>
-                <w:bottom w:space="0" w:sz="0" w:val="nil"/>
-                <w:right w:space="0" w:sz="0" w:val="nil"/>
-                <w:between w:space="0" w:sz="0" w:val="nil"/>
-              </w:pBdr>
-              <w:shd w:fill="auto" w:val="clear"/>
-              <w:spacing w:after="0" w:before="0" w:line="240" w:lineRule="auto"/>
-              <w:ind w:left="0" w:right="0" w:firstLine="0"/>
-              <w:jc w:val="left"/>
-              <w:rPr>
-                <w:rFonts w:ascii="Arial" w:cs="Arial" w:eastAsia="Arial" w:hAnsi="Arial"/>
-                <w:i w:val="0"/>
-                <w:iCs w:val="0"/>
-                <w:smallCaps w:val="0"/>
-                <w:strike w:val="0"/>
-                <w:color w:val="000000"/>
-                <w:sz w:val="24"/>
-                <w:szCs w:val="24"/>
-                <w:u w:val="none"/>
-                <w:shd w:fill="auto" w:val="clear"/>
-                <w:vertAlign w:val="baseline"/>
-              </w:rPr>
-            </w:pPr>
-            <w:r>
-              <w:rPr>
-                <w:rFonts w:ascii="Arial" w:cs="Arial" w:eastAsia="Arial" w:hAnsi="Arial"/>
-                <w:sz w:val="24"/>
-                <w:szCs w:val="24"/>
-                <w:rtl w:val="0"/>
-              </w:rPr>
-              <w:t xml:space="preserve">Franz Kafka – Proměna – překlad Zbyněk Sekal</w:t>
-            </w:r>
-            <w:r>
-              <w:rPr>
-                <w:rtl w:val="0"/>
-              </w:rPr>
+              <w:rPr>
+                <w:rFonts w:ascii="Arial" w:cs="Arial" w:eastAsia="Arial" w:hAnsi="Arial"/>
+                <w:sz w:val="24"/>
+                <w:szCs w:val="24"/>
+              </w:rPr>
+            </w:pPr>
+            <w:r>
+              <w:rPr>
+                <w:rFonts w:ascii="Arial" w:cs="Arial" w:eastAsia="Arial" w:hAnsi="Arial"/>
+                <w:sz w:val="24"/>
+                <w:szCs w:val="24"/>
+                <w:rtl w:val="0"/>
+              </w:rPr>
+              <w:t xml:space="preserve">Romain Rolland – Petr a Lucie – překlad Jaroslav Zaorálek</w:t>
             </w:r>
           </w:p>
         </w:tc>
@@ -2326,7 +2191,6 @@
             <w:pPr>
               <w:keepNext w:val="0"/>
               <w:keepLines w:val="0"/>
-              <w:pageBreakBefore w:val="0"/>
               <w:widowControl w:val="0"/>
               <w:pBdr>
                 <w:top w:space="0" w:sz="0" w:val="nil"/>
@@ -2387,48 +2251,20 @@
           </w:tcPr>
           <w:p>
             <w:pPr>
-              <w:keepNext w:val="0"/>
-              <w:keepLines w:val="0"/>
-              <w:pageBreakBefore w:val="0"/>
-              <w:widowControl w:val="0"/>
-              <w:pBdr>
-                <w:top w:space="0" w:sz="0" w:val="nil"/>
-                <w:left w:space="0" w:sz="0" w:val="nil"/>
-                <w:bottom w:space="0" w:sz="0" w:val="nil"/>
-                <w:right w:space="0" w:sz="0" w:val="nil"/>
-                <w:between w:space="0" w:sz="0" w:val="nil"/>
-              </w:pBdr>
-              <w:shd w:fill="auto" w:val="clear"/>
-              <w:spacing w:after="0" w:before="0" w:line="240" w:lineRule="auto"/>
-              <w:ind w:left="0" w:right="0" w:firstLine="0"/>
-              <w:jc w:val="left"/>
-              <w:rPr>
-                <w:rFonts w:ascii="Arial" w:cs="Arial" w:eastAsia="Arial" w:hAnsi="Arial"/>
-                <w:i w:val="0"/>
-                <w:iCs w:val="0"/>
-                <w:smallCaps w:val="0"/>
-                <w:strike w:val="0"/>
-                <w:color w:val="000000"/>
-                <w:sz w:val="24"/>
-                <w:szCs w:val="24"/>
-                <w:u w:val="none"/>
-                <w:shd w:fill="auto" w:val="clear"/>
-                <w:vertAlign w:val="baseline"/>
-              </w:rPr>
-            </w:pPr>
-            <w:r>
-              <w:rPr>
-                <w:rFonts w:ascii="Arial" w:cs="Arial" w:eastAsia="Arial" w:hAnsi="Arial"/>
-                <w:sz w:val="24"/>
-                <w:szCs w:val="24"/>
-                <w:rtl w:val="0"/>
-              </w:rPr>
-              <w:t xml:space="preserve">Romain Rolland – Petr a Lucie – překlad Jaroslav Zaorálek</w:t>
-            </w:r>
-            <w:r>
-              <w:rPr>
-                <w:rtl w:val="0"/>
-              </w:rPr>
+              <w:rPr>
+                <w:rFonts w:ascii="Arial" w:cs="Arial" w:eastAsia="Arial" w:hAnsi="Arial"/>
+                <w:sz w:val="24"/>
+                <w:szCs w:val="24"/>
+              </w:rPr>
+            </w:pPr>
+            <w:r>
+              <w:rPr>
+                <w:rFonts w:ascii="Arial" w:cs="Arial" w:eastAsia="Arial" w:hAnsi="Arial"/>
+                <w:sz w:val="24"/>
+                <w:szCs w:val="24"/>
+                <w:rtl w:val="0"/>
+              </w:rPr>
+              <w:t xml:space="preserve">Antoine de Saint-Exupéry – Malý princ – překlad Richard Podaný</w:t>
             </w:r>
           </w:p>
         </w:tc>
@@ -2452,7 +2288,6 @@
             <w:pPr>
               <w:keepNext w:val="0"/>
               <w:keepLines w:val="0"/>
-              <w:pageBreakBefore w:val="0"/>
               <w:widowControl w:val="0"/>
               <w:pBdr>
                 <w:top w:space="0" w:sz="0" w:val="nil"/>
@@ -2513,48 +2348,20 @@
           </w:tcPr>
           <w:p>
             <w:pPr>
-              <w:keepNext w:val="0"/>
-              <w:keepLines w:val="0"/>
-              <w:pageBreakBefore w:val="0"/>
-              <w:widowControl w:val="0"/>
-              <w:pBdr>
-                <w:top w:space="0" w:sz="0" w:val="nil"/>
-                <w:left w:space="0" w:sz="0" w:val="nil"/>
-                <w:bottom w:space="0" w:sz="0" w:val="nil"/>
-                <w:right w:space="0" w:sz="0" w:val="nil"/>
-                <w:between w:space="0" w:sz="0" w:val="nil"/>
-              </w:pBdr>
-              <w:shd w:fill="auto" w:val="clear"/>
-              <w:spacing w:after="0" w:before="0" w:line="240" w:lineRule="auto"/>
-              <w:ind w:left="0" w:right="0" w:firstLine="0"/>
-              <w:jc w:val="left"/>
-              <w:rPr>
-                <w:rFonts w:ascii="Arial" w:cs="Arial" w:eastAsia="Arial" w:hAnsi="Arial"/>
-                <w:i w:val="0"/>
-                <w:iCs w:val="0"/>
-                <w:smallCaps w:val="0"/>
-                <w:strike w:val="0"/>
-                <w:color w:val="000000"/>
-                <w:sz w:val="24"/>
-                <w:szCs w:val="24"/>
-                <w:u w:val="none"/>
-                <w:shd w:fill="auto" w:val="clear"/>
-                <w:vertAlign w:val="baseline"/>
-              </w:rPr>
-            </w:pPr>
-            <w:r>
-              <w:rPr>
-                <w:rFonts w:ascii="Arial" w:cs="Arial" w:eastAsia="Arial" w:hAnsi="Arial"/>
-                <w:sz w:val="24"/>
-                <w:szCs w:val="24"/>
-                <w:rtl w:val="0"/>
-              </w:rPr>
-              <w:t xml:space="preserve">Antoine de Saint-Exupéry – Malý princ – překlad Richard Podaný</w:t>
-            </w:r>
-            <w:r>
-              <w:rPr>
-                <w:rtl w:val="0"/>
-              </w:rPr>
+              <w:rPr>
+                <w:rFonts w:ascii="Arial" w:cs="Arial" w:eastAsia="Arial" w:hAnsi="Arial"/>
+                <w:sz w:val="24"/>
+                <w:szCs w:val="24"/>
+              </w:rPr>
+            </w:pPr>
+            <w:r>
+              <w:rPr>
+                <w:rFonts w:ascii="Arial" w:cs="Arial" w:eastAsia="Arial" w:hAnsi="Arial"/>
+                <w:sz w:val="24"/>
+                <w:szCs w:val="24"/>
+                <w:rtl w:val="0"/>
+              </w:rPr>
+              <w:t xml:space="preserve">Francis Scott Fitzgerald – Velký Gatsby – překlad Martin Pokorný</w:t>
             </w:r>
           </w:p>
         </w:tc>
@@ -2578,7 +2385,6 @@
             <w:pPr>
               <w:keepNext w:val="0"/>
               <w:keepLines w:val="0"/>
-              <w:pageBreakBefore w:val="0"/>
               <w:widowControl w:val="0"/>
               <w:pBdr>
                 <w:top w:space="0" w:sz="0" w:val="nil"/>
@@ -2639,48 +2445,20 @@
           </w:tcPr>
           <w:p>
             <w:pPr>
-              <w:keepNext w:val="0"/>
-              <w:keepLines w:val="0"/>
-              <w:pageBreakBefore w:val="0"/>
-              <w:widowControl w:val="0"/>
-              <w:pBdr>
-                <w:top w:space="0" w:sz="0" w:val="nil"/>
-                <w:left w:space="0" w:sz="0" w:val="nil"/>
-                <w:bottom w:space="0" w:sz="0" w:val="nil"/>
-                <w:right w:space="0" w:sz="0" w:val="nil"/>
-                <w:between w:space="0" w:sz="0" w:val="nil"/>
-              </w:pBdr>
-              <w:shd w:fill="auto" w:val="clear"/>
-              <w:spacing w:after="0" w:before="0" w:line="240" w:lineRule="auto"/>
-              <w:ind w:left="0" w:right="0" w:firstLine="0"/>
-              <w:jc w:val="left"/>
-              <w:rPr>
-                <w:rFonts w:ascii="Arial" w:cs="Arial" w:eastAsia="Arial" w:hAnsi="Arial"/>
-                <w:i w:val="0"/>
-                <w:iCs w:val="0"/>
-                <w:smallCaps w:val="0"/>
-                <w:strike w:val="0"/>
-                <w:color w:val="000000"/>
-                <w:sz w:val="24"/>
-                <w:szCs w:val="24"/>
-                <w:u w:val="none"/>
-                <w:shd w:fill="auto" w:val="clear"/>
-                <w:vertAlign w:val="baseline"/>
-              </w:rPr>
-            </w:pPr>
-            <w:r>
-              <w:rPr>
-                <w:rFonts w:ascii="Arial" w:cs="Arial" w:eastAsia="Arial" w:hAnsi="Arial"/>
-                <w:sz w:val="24"/>
-                <w:szCs w:val="24"/>
-                <w:rtl w:val="0"/>
-              </w:rPr>
-              <w:t xml:space="preserve">John Steinbeck – O myších a lidech – překlad Vladimír Vendyš</w:t>
-            </w:r>
-            <w:r>
-              <w:rPr>
-                <w:rtl w:val="0"/>
-              </w:rPr>
+              <w:rPr>
+                <w:rFonts w:ascii="Arial" w:cs="Arial" w:eastAsia="Arial" w:hAnsi="Arial"/>
+                <w:sz w:val="24"/>
+                <w:szCs w:val="24"/>
+              </w:rPr>
+            </w:pPr>
+            <w:r>
+              <w:rPr>
+                <w:rFonts w:ascii="Arial" w:cs="Arial" w:eastAsia="Arial" w:hAnsi="Arial"/>
+                <w:sz w:val="24"/>
+                <w:szCs w:val="24"/>
+                <w:rtl w:val="0"/>
+              </w:rPr>
+              <w:t xml:space="preserve">George Orwell – Farma zvířat – překlad Gabriel Gössel</w:t>
             </w:r>
           </w:p>
         </w:tc>
@@ -2704,7 +2482,6 @@
             <w:pPr>
               <w:keepNext w:val="0"/>
               <w:keepLines w:val="0"/>
-              <w:pageBreakBefore w:val="0"/>
               <w:widowControl w:val="0"/>
               <w:pBdr>
                 <w:top w:space="0" w:sz="0" w:val="nil"/>
@@ -2765,48 +2542,20 @@
           </w:tcPr>
           <w:p>
             <w:pPr>
-              <w:keepNext w:val="0"/>
-              <w:keepLines w:val="0"/>
-              <w:pageBreakBefore w:val="0"/>
-              <w:widowControl w:val="0"/>
-              <w:pBdr>
-                <w:top w:space="0" w:sz="0" w:val="nil"/>
-                <w:left w:space="0" w:sz="0" w:val="nil"/>
-                <w:bottom w:space="0" w:sz="0" w:val="nil"/>
-                <w:right w:space="0" w:sz="0" w:val="nil"/>
-                <w:between w:space="0" w:sz="0" w:val="nil"/>
-              </w:pBdr>
-              <w:shd w:fill="auto" w:val="clear"/>
-              <w:spacing w:after="0" w:before="0" w:line="240" w:lineRule="auto"/>
-              <w:ind w:left="0" w:right="0" w:firstLine="0"/>
-              <w:jc w:val="left"/>
-              <w:rPr>
-                <w:rFonts w:ascii="Arial" w:cs="Arial" w:eastAsia="Arial" w:hAnsi="Arial"/>
-                <w:i w:val="0"/>
-                <w:iCs w:val="0"/>
-                <w:smallCaps w:val="0"/>
-                <w:strike w:val="0"/>
-                <w:color w:val="000000"/>
-                <w:sz w:val="24"/>
-                <w:szCs w:val="24"/>
-                <w:u w:val="none"/>
-                <w:shd w:fill="auto" w:val="clear"/>
-                <w:vertAlign w:val="baseline"/>
-              </w:rPr>
-            </w:pPr>
-            <w:r>
-              <w:rPr>
-                <w:rFonts w:ascii="Arial" w:cs="Arial" w:eastAsia="Arial" w:hAnsi="Arial"/>
-                <w:sz w:val="24"/>
-                <w:szCs w:val="24"/>
-                <w:rtl w:val="0"/>
-              </w:rPr>
-              <w:t xml:space="preserve">Francis Scott Fitzgerald – Velký Gatsby – překlad Martin Pokorný</w:t>
-            </w:r>
-            <w:r>
-              <w:rPr>
-                <w:rtl w:val="0"/>
-              </w:rPr>
+              <w:rPr>
+                <w:rFonts w:ascii="Arial" w:cs="Arial" w:eastAsia="Arial" w:hAnsi="Arial"/>
+                <w:sz w:val="24"/>
+                <w:szCs w:val="24"/>
+              </w:rPr>
+            </w:pPr>
+            <w:r>
+              <w:rPr>
+                <w:rFonts w:ascii="Arial" w:cs="Arial" w:eastAsia="Arial" w:hAnsi="Arial"/>
+                <w:sz w:val="24"/>
+                <w:szCs w:val="24"/>
+                <w:rtl w:val="0"/>
+              </w:rPr>
+              <w:t xml:space="preserve">Samuel Beckett – Čekání na Godota – překlad Karel Kraus</w:t>
             </w:r>
           </w:p>
         </w:tc>
@@ -2830,7 +2579,6 @@
             <w:pPr>
               <w:keepNext w:val="0"/>
               <w:keepLines w:val="0"/>
-              <w:pageBreakBefore w:val="0"/>
               <w:widowControl w:val="0"/>
               <w:pBdr>
                 <w:top w:space="0" w:sz="0" w:val="nil"/>
@@ -2891,48 +2639,20 @@
           </w:tcPr>
           <w:p>
             <w:pPr>
-              <w:keepNext w:val="0"/>
-              <w:keepLines w:val="0"/>
-              <w:pageBreakBefore w:val="0"/>
-              <w:widowControl w:val="0"/>
-              <w:pBdr>
-                <w:top w:space="0" w:sz="0" w:val="nil"/>
-                <w:left w:space="0" w:sz="0" w:val="nil"/>
-                <w:bottom w:space="0" w:sz="0" w:val="nil"/>
-                <w:right w:space="0" w:sz="0" w:val="nil"/>
-                <w:between w:space="0" w:sz="0" w:val="nil"/>
-              </w:pBdr>
-              <w:shd w:fill="auto" w:val="clear"/>
-              <w:spacing w:after="0" w:before="0" w:line="240" w:lineRule="auto"/>
-              <w:ind w:left="0" w:right="0" w:firstLine="0"/>
-              <w:jc w:val="left"/>
-              <w:rPr>
-                <w:rFonts w:ascii="Arial" w:cs="Arial" w:eastAsia="Arial" w:hAnsi="Arial"/>
-                <w:i w:val="0"/>
-                <w:iCs w:val="0"/>
-                <w:smallCaps w:val="0"/>
-                <w:strike w:val="0"/>
-                <w:color w:val="000000"/>
-                <w:sz w:val="24"/>
-                <w:szCs w:val="24"/>
-                <w:u w:val="none"/>
-                <w:shd w:fill="auto" w:val="clear"/>
-                <w:vertAlign w:val="baseline"/>
-              </w:rPr>
-            </w:pPr>
-            <w:r>
-              <w:rPr>
-                <w:rFonts w:ascii="Arial" w:cs="Arial" w:eastAsia="Arial" w:hAnsi="Arial"/>
-                <w:sz w:val="24"/>
-                <w:szCs w:val="24"/>
-                <w:rtl w:val="0"/>
-              </w:rPr>
-              <w:t xml:space="preserve">George Orwell – Farma zvířat – překlad Gabriel Gössel</w:t>
-            </w:r>
-            <w:r>
-              <w:rPr>
-                <w:rtl w:val="0"/>
-              </w:rPr>
+              <w:rPr>
+                <w:rFonts w:ascii="Arial" w:cs="Arial" w:eastAsia="Arial" w:hAnsi="Arial"/>
+                <w:sz w:val="24"/>
+                <w:szCs w:val="24"/>
+              </w:rPr>
+            </w:pPr>
+            <w:r>
+              <w:rPr>
+                <w:rFonts w:ascii="Arial" w:cs="Arial" w:eastAsia="Arial" w:hAnsi="Arial"/>
+                <w:sz w:val="24"/>
+                <w:szCs w:val="24"/>
+                <w:rtl w:val="0"/>
+              </w:rPr>
+              <w:t xml:space="preserve">Viktor Dyk – Krysař</w:t>
             </w:r>
           </w:p>
         </w:tc>
@@ -2956,7 +2676,6 @@
             <w:pPr>
               <w:keepNext w:val="0"/>
               <w:keepLines w:val="0"/>
-              <w:pageBreakBefore w:val="0"/>
               <w:widowControl w:val="0"/>
               <w:pBdr>
                 <w:top w:space="0" w:sz="0" w:val="nil"/>
@@ -3017,48 +2736,20 @@
           </w:tcPr>
           <w:p>
             <w:pPr>
-              <w:keepNext w:val="0"/>
-              <w:keepLines w:val="0"/>
-              <w:pageBreakBefore w:val="0"/>
-              <w:widowControl w:val="0"/>
-              <w:pBdr>
-                <w:top w:space="0" w:sz="0" w:val="nil"/>
-                <w:left w:space="0" w:sz="0" w:val="nil"/>
-                <w:bottom w:space="0" w:sz="0" w:val="nil"/>
-                <w:right w:space="0" w:sz="0" w:val="nil"/>
-                <w:between w:space="0" w:sz="0" w:val="nil"/>
-              </w:pBdr>
-              <w:shd w:fill="auto" w:val="clear"/>
-              <w:spacing w:after="0" w:before="0" w:line="240" w:lineRule="auto"/>
-              <w:ind w:left="0" w:right="0" w:firstLine="0"/>
-              <w:jc w:val="left"/>
-              <w:rPr>
-                <w:rFonts w:ascii="Arial" w:cs="Arial" w:eastAsia="Arial" w:hAnsi="Arial"/>
-                <w:i w:val="0"/>
-                <w:iCs w:val="0"/>
-                <w:smallCaps w:val="0"/>
-                <w:strike w:val="0"/>
-                <w:color w:val="000000"/>
-                <w:sz w:val="24"/>
-                <w:szCs w:val="24"/>
-                <w:u w:val="none"/>
-                <w:shd w:fill="auto" w:val="clear"/>
-                <w:vertAlign w:val="baseline"/>
-              </w:rPr>
-            </w:pPr>
-            <w:r>
-              <w:rPr>
-                <w:rFonts w:ascii="Arial" w:cs="Arial" w:eastAsia="Arial" w:hAnsi="Arial"/>
-                <w:sz w:val="24"/>
-                <w:szCs w:val="24"/>
-                <w:rtl w:val="0"/>
-              </w:rPr>
-              <w:t xml:space="preserve">Samuel Beckett – Čekání na Godota – překlad Karel Kraus</w:t>
-            </w:r>
-            <w:r>
-              <w:rPr>
-                <w:rtl w:val="0"/>
-              </w:rPr>
+              <w:rPr>
+                <w:rFonts w:ascii="Arial" w:cs="Arial" w:eastAsia="Arial" w:hAnsi="Arial"/>
+                <w:sz w:val="24"/>
+                <w:szCs w:val="24"/>
+              </w:rPr>
+            </w:pPr>
+            <w:r>
+              <w:rPr>
+                <w:rFonts w:ascii="Arial" w:cs="Arial" w:eastAsia="Arial" w:hAnsi="Arial"/>
+                <w:sz w:val="24"/>
+                <w:szCs w:val="24"/>
+                <w:rtl w:val="0"/>
+              </w:rPr>
+              <w:t xml:space="preserve">Josef Čapek a Karel Čapek – Ze života hmyzu</w:t>
             </w:r>
           </w:p>
         </w:tc>
@@ -3082,7 +2773,6 @@
             <w:pPr>
               <w:keepNext w:val="0"/>
               <w:keepLines w:val="0"/>
-              <w:pageBreakBefore w:val="0"/>
               <w:widowControl w:val="0"/>
               <w:pBdr>
                 <w:top w:space="0" w:sz="0" w:val="nil"/>
@@ -3143,33 +2833,10 @@
           </w:tcPr>
           <w:p>
             <w:pPr>
-              <w:keepNext w:val="0"/>
-              <w:keepLines w:val="0"/>
-              <w:pageBreakBefore w:val="0"/>
-              <w:widowControl w:val="0"/>
-              <w:pBdr>
-                <w:top w:space="0" w:sz="0" w:val="nil"/>
-                <w:left w:space="0" w:sz="0" w:val="nil"/>
-                <w:bottom w:space="0" w:sz="0" w:val="nil"/>
-                <w:right w:space="0" w:sz="0" w:val="nil"/>
-                <w:between w:space="0" w:sz="0" w:val="nil"/>
-              </w:pBdr>
-              <w:shd w:fill="auto" w:val="clear"/>
-              <w:spacing w:after="0" w:before="0" w:line="240" w:lineRule="auto"/>
-              <w:ind w:left="0" w:right="0" w:firstLine="0"/>
-              <w:jc w:val="left"/>
-              <w:rPr>
-                <w:rFonts w:ascii="Arial" w:cs="Arial" w:eastAsia="Arial" w:hAnsi="Arial"/>
-                <w:i w:val="0"/>
-                <w:iCs w:val="0"/>
-                <w:smallCaps w:val="0"/>
-                <w:strike w:val="0"/>
-                <w:color w:val="000000"/>
-                <w:sz w:val="24"/>
-                <w:szCs w:val="24"/>
-                <w:u w:val="none"/>
-                <w:shd w:fill="auto" w:val="clear"/>
-                <w:vertAlign w:val="baseline"/>
+              <w:rPr>
+                <w:rFonts w:ascii="Arial" w:cs="Arial" w:eastAsia="Arial" w:hAnsi="Arial"/>
+                <w:sz w:val="24"/>
+                <w:szCs w:val="24"/>
               </w:rPr>
             </w:pPr>
             <w:r>
@@ -3180,11 +2847,6 @@
                 <w:rtl w:val="0"/>
               </w:rPr>
               <w:t xml:space="preserve">Karel Čapek – Bílá nemoc</w:t>
-            </w:r>
-            <w:r>
-              <w:rPr>
-                <w:rtl w:val="0"/>
-              </w:rPr>
             </w:r>
           </w:p>
         </w:tc>
@@ -3208,7 +2870,6 @@
             <w:pPr>
               <w:keepNext w:val="0"/>
               <w:keepLines w:val="0"/>
-              <w:pageBreakBefore w:val="0"/>
               <w:widowControl w:val="0"/>
               <w:pBdr>
                 <w:top w:space="0" w:sz="0" w:val="nil"/>
@@ -3269,33 +2930,10 @@
           </w:tcPr>
           <w:p>
             <w:pPr>
-              <w:keepNext w:val="0"/>
-              <w:keepLines w:val="0"/>
-              <w:pageBreakBefore w:val="0"/>
-              <w:widowControl w:val="0"/>
-              <w:pBdr>
-                <w:top w:space="0" w:sz="0" w:val="nil"/>
-                <w:left w:space="0" w:sz="0" w:val="nil"/>
-                <w:bottom w:space="0" w:sz="0" w:val="nil"/>
-                <w:right w:space="0" w:sz="0" w:val="nil"/>
-                <w:between w:space="0" w:sz="0" w:val="nil"/>
-              </w:pBdr>
-              <w:shd w:fill="auto" w:val="clear"/>
-              <w:spacing w:after="0" w:before="0" w:line="240" w:lineRule="auto"/>
-              <w:ind w:left="0" w:right="0" w:firstLine="0"/>
-              <w:jc w:val="left"/>
-              <w:rPr>
-                <w:rFonts w:ascii="Arial" w:cs="Arial" w:eastAsia="Arial" w:hAnsi="Arial"/>
-                <w:i w:val="0"/>
-                <w:iCs w:val="0"/>
-                <w:smallCaps w:val="0"/>
-                <w:strike w:val="0"/>
-                <w:color w:val="000000"/>
-                <w:sz w:val="24"/>
-                <w:szCs w:val="24"/>
-                <w:u w:val="none"/>
-                <w:shd w:fill="auto" w:val="clear"/>
-                <w:vertAlign w:val="baseline"/>
+              <w:rPr>
+                <w:rFonts w:ascii="Arial" w:cs="Arial" w:eastAsia="Arial" w:hAnsi="Arial"/>
+                <w:sz w:val="24"/>
+                <w:szCs w:val="24"/>
               </w:rPr>
             </w:pPr>
             <w:r>
@@ -3306,11 +2944,6 @@
                 <w:rtl w:val="0"/>
               </w:rPr>
               <w:t xml:space="preserve">Ota Pavel – Smrt krásných srnců</w:t>
-            </w:r>
-            <w:r>
-              <w:rPr>
-                <w:rtl w:val="0"/>
-              </w:rPr>
             </w:r>
           </w:p>
         </w:tc>
@@ -3333,7 +2966,6 @@
             <w:pPr>
               <w:keepNext w:val="0"/>
               <w:keepLines w:val="0"/>
-              <w:pageBreakBefore w:val="0"/>
               <w:widowControl w:val="0"/>
               <w:pBdr>
                 <w:top w:space="0" w:sz="0" w:val="nil"/>
@@ -3395,7 +3027,6 @@
             <w:pPr>
               <w:keepNext w:val="0"/>
               <w:keepLines w:val="0"/>
-              <w:pageBreakBefore w:val="0"/>
               <w:widowControl w:val="0"/>
               <w:pBdr>
                 <w:top w:space="0" w:sz="0" w:val="nil"/>
@@ -3774,234 +3405,6 @@
       <w:szCs w:val="72"/>
     </w:rPr>
   </w:style>
-  <w:style w:type="paragraph" w:styleId="Normální">
-    <w:name w:val="Normální"/>
-    <w:next w:val="Normální"/>
-    <w:autoRedefine w:val="0"/>
-    <w:hidden w:val="0"/>
-    <w:qFormat w:val="0"/>
-    <w:pPr>
-      <w:widowControl w:val="0"/>
-      <w:suppressAutoHyphens w:val="1"/>
-      <w:autoSpaceDE w:val="0"/>
-      <w:autoSpaceDN w:val="0"/>
-      <w:spacing w:line="1" w:lineRule="atLeast"/>
-      <w:ind w:leftChars="-1" w:rightChars="0" w:firstLineChars="-1"/>
-      <w:textDirection w:val="btLr"/>
-      <w:textAlignment w:val="top"/>
-      <w:outlineLvl w:val="0"/>
-    </w:pPr>
-    <w:rPr>
-      <w:rFonts w:ascii="Arial" w:cs="Arial" w:eastAsia="Arial" w:hAnsi="Arial"/>
-      <w:w w:val="100"/>
-      <w:position w:val="-1"/>
-      <w:sz w:val="22"/>
-      <w:szCs w:val="22"/>
-      <w:effect w:val="none"/>
-      <w:vertAlign w:val="baseline"/>
-      <w:cs w:val="0"/>
-      <w:em w:val="none"/>
-      <w:lang w:bidi="ar-SA" w:eastAsia="en-US" w:val="cs-CZ"/>
-    </w:rPr>
-  </w:style>
-  <w:style w:type="character" w:styleId="Standardnípísmoodstavce">
-    <w:name w:val="Standardní písmo odstavce"/>
-    <w:next w:val="Standardnípísmoodstavce"/>
-    <w:autoRedefine w:val="0"/>
-    <w:hidden w:val="0"/>
-    <w:qFormat w:val="1"/>
-    <w:rPr>
-      <w:w w:val="100"/>
-      <w:position w:val="-1"/>
-      <w:effect w:val="none"/>
-      <w:vertAlign w:val="baseline"/>
-      <w:cs w:val="0"/>
-      <w:em w:val="none"/>
-      <w:lang/>
-    </w:rPr>
-  </w:style>
-  <w:style w:type="table" w:styleId="Normálnítabulka">
-    <w:name w:val="Normální tabulka"/>
-    <w:next w:val="Normálnítabulka"/>
-    <w:autoRedefine w:val="0"/>
-    <w:hidden w:val="0"/>
-    <w:qFormat w:val="1"/>
-    <w:pPr>
-      <w:suppressAutoHyphens w:val="1"/>
-      <w:spacing w:line="1" w:lineRule="atLeast"/>
-      <w:ind w:leftChars="-1" w:rightChars="0" w:firstLineChars="-1"/>
-      <w:textDirection w:val="btLr"/>
-      <w:textAlignment w:val="top"/>
-      <w:outlineLvl w:val="0"/>
-    </w:pPr>
-    <w:rPr>
-      <w:w w:val="100"/>
-      <w:position w:val="-1"/>
-      <w:effect w:val="none"/>
-      <w:vertAlign w:val="baseline"/>
-      <w:cs w:val="0"/>
-      <w:em w:val="none"/>
-      <w:lang/>
-    </w:rPr>
-    <w:tblPr>
-      <w:jc w:val="left"/>
-      <w:tblInd w:w="0.0" w:type="dxa"/>
-      <w:tblCellMar>
-        <w:top w:w="0.0" w:type="dxa"/>
-        <w:left w:w="108.0" w:type="dxa"/>
-        <w:bottom w:w="0.0" w:type="dxa"/>
-        <w:right w:w="108.0" w:type="dxa"/>
-      </w:tblCellMar>
-    </w:tblPr>
-  </w:style>
-  <w:style w:type="numbering" w:styleId="Bezseznamu">
-    <w:name w:val="Bez seznamu"/>
-    <w:next w:val="Bezseznamu"/>
-    <w:autoRedefine w:val="0"/>
-    <w:hidden w:val="0"/>
-    <w:qFormat w:val="1"/>
-    <w:pPr>
-      <w:suppressAutoHyphens w:val="1"/>
-      <w:spacing w:line="1" w:lineRule="atLeast"/>
-      <w:ind w:leftChars="-1" w:rightChars="0" w:firstLineChars="-1"/>
-      <w:textDirection w:val="btLr"/>
-      <w:textAlignment w:val="top"/>
-      <w:outlineLvl w:val="0"/>
-    </w:pPr>
-  </w:style>
-  <w:style w:type="table" w:styleId="TableNormal">
-    <w:name w:val="Table Normal"/>
-    <w:next w:val="TableNormal"/>
-    <w:autoRedefine w:val="0"/>
-    <w:hidden w:val="0"/>
-    <w:qFormat w:val="1"/>
-    <w:pPr>
-      <w:widowControl w:val="0"/>
-      <w:suppressAutoHyphens w:val="1"/>
-      <w:autoSpaceDE w:val="0"/>
-      <w:autoSpaceDN w:val="0"/>
-      <w:spacing w:line="1" w:lineRule="atLeast"/>
-      <w:ind w:leftChars="-1" w:rightChars="0" w:firstLineChars="-1"/>
-      <w:textDirection w:val="btLr"/>
-      <w:textAlignment w:val="top"/>
-      <w:outlineLvl w:val="0"/>
-    </w:pPr>
-    <w:rPr>
-      <w:w w:val="100"/>
-      <w:position w:val="-1"/>
-      <w:sz w:val="22"/>
-      <w:szCs w:val="22"/>
-      <w:effect w:val="none"/>
-      <w:vertAlign w:val="baseline"/>
-      <w:cs w:val="0"/>
-      <w:em w:val="none"/>
-      <w:lang w:bidi="ar-SA" w:eastAsia="en-US" w:val="en-US"/>
-    </w:rPr>
-    <w:tblPr>
-      <w:tblStyle w:val="TableNormal"/>
-      <w:jc w:val="left"/>
-      <w:tblInd w:w="0.0" w:type="dxa"/>
-      <w:tblCellMar>
-        <w:top w:w="0.0" w:type="dxa"/>
-        <w:left w:w="0.0" w:type="dxa"/>
-        <w:bottom w:w="0.0" w:type="dxa"/>
-        <w:right w:w="0.0" w:type="dxa"/>
-      </w:tblCellMar>
-    </w:tblPr>
-  </w:style>
-  <w:style w:type="paragraph" w:styleId="Základnítext">
-    <w:name w:val="Základní text"/>
-    <w:basedOn w:val="Normální"/>
-    <w:next w:val="Základnítext"/>
-    <w:autoRedefine w:val="0"/>
-    <w:hidden w:val="0"/>
-    <w:qFormat w:val="0"/>
-    <w:pPr>
-      <w:widowControl w:val="0"/>
-      <w:suppressAutoHyphens w:val="1"/>
-      <w:autoSpaceDE w:val="0"/>
-      <w:autoSpaceDN w:val="0"/>
-      <w:spacing w:line="1" w:lineRule="atLeast"/>
-      <w:ind w:leftChars="-1" w:rightChars="0" w:firstLineChars="-1"/>
-      <w:textDirection w:val="btLr"/>
-      <w:textAlignment w:val="top"/>
-      <w:outlineLvl w:val="0"/>
-    </w:pPr>
-    <w:rPr>
-      <w:rFonts w:ascii="Arial" w:cs="Arial" w:eastAsia="Arial" w:hAnsi="Arial"/>
-      <w:w w:val="100"/>
-      <w:position w:val="-1"/>
-      <w:sz w:val="32"/>
-      <w:szCs w:val="32"/>
-      <w:effect w:val="none"/>
-      <w:vertAlign w:val="baseline"/>
-      <w:cs w:val="0"/>
-      <w:em w:val="none"/>
-      <w:lang w:bidi="ar-SA" w:eastAsia="en-US" w:val="cs-CZ"/>
-    </w:rPr>
-  </w:style>
-  <w:style w:type="paragraph" w:styleId="Odstavecseseznamem">
-    <w:name w:val="Odstavec se seznamem"/>
-    <w:basedOn w:val="Normální"/>
-    <w:next w:val="Odstavecseseznamem"/>
-    <w:autoRedefine w:val="0"/>
-    <w:hidden w:val="0"/>
-    <w:qFormat w:val="0"/>
-    <w:pPr>
-      <w:widowControl w:val="0"/>
-      <w:suppressAutoHyphens w:val="1"/>
-      <w:autoSpaceDE w:val="0"/>
-      <w:autoSpaceDN w:val="0"/>
-      <w:spacing w:line="1" w:lineRule="atLeast"/>
-      <w:ind w:leftChars="-1" w:rightChars="0" w:firstLineChars="-1"/>
-      <w:textDirection w:val="btLr"/>
-      <w:textAlignment w:val="top"/>
-      <w:outlineLvl w:val="0"/>
-    </w:pPr>
-    <w:rPr>
-      <w:rFonts w:ascii="Arial" w:cs="Arial" w:eastAsia="Arial" w:hAnsi="Arial"/>
-      <w:w w:val="100"/>
-      <w:position w:val="-1"/>
-      <w:sz w:val="22"/>
-      <w:szCs w:val="22"/>
-      <w:effect w:val="none"/>
-      <w:vertAlign w:val="baseline"/>
-      <w:cs w:val="0"/>
-      <w:em w:val="none"/>
-      <w:lang w:bidi="ar-SA" w:eastAsia="en-US" w:val="cs-CZ"/>
-    </w:rPr>
-  </w:style>
-  <w:style w:type="paragraph" w:styleId="TableParagraph">
-    <w:name w:val="Table Paragraph"/>
-    <w:basedOn w:val="Normální"/>
-    <w:next w:val="TableParagraph"/>
-    <w:autoRedefine w:val="0"/>
-    <w:hidden w:val="0"/>
-    <w:qFormat w:val="0"/>
-    <w:pPr>
-      <w:widowControl w:val="0"/>
-      <w:suppressAutoHyphens w:val="1"/>
-      <w:autoSpaceDE w:val="0"/>
-      <w:autoSpaceDN w:val="0"/>
-      <w:spacing w:line="1" w:lineRule="atLeast"/>
-      <w:ind w:leftChars="-1" w:rightChars="0" w:firstLineChars="-1"/>
-      <w:textDirection w:val="btLr"/>
-      <w:textAlignment w:val="top"/>
-      <w:outlineLvl w:val="0"/>
-    </w:pPr>
-    <w:rPr>
-      <w:rFonts w:ascii="Arial" w:cs="Arial" w:eastAsia="Arial" w:hAnsi="Arial"/>
-      <w:w w:val="100"/>
-      <w:position w:val="-1"/>
-      <w:sz w:val="22"/>
-      <w:szCs w:val="22"/>
-      <w:effect w:val="none"/>
-      <w:vertAlign w:val="baseline"/>
-      <w:cs w:val="0"/>
-      <w:em w:val="none"/>
-      <w:lang w:bidi="ar-SA" w:eastAsia="en-US" w:val="cs-CZ"/>
-    </w:rPr>
-  </w:style>
   <w:style w:type="paragraph" w:styleId="Subtitle">
     <w:name w:val="Subtitle"/>
     <w:basedOn w:val="Normal"/>
@@ -4023,6 +3426,14 @@
   </w:style>
   <w:style w:type="table" w:styleId="Table1">
     <w:basedOn w:val="TableNormal"/>
+    <w:pPr>
+      <w:widowControl w:val="0"/>
+    </w:pPr>
+    <w:rPr>
+      <w:sz w:val="22"/>
+      <w:szCs w:val="22"/>
+      <w:vertAlign w:val="baseline"/>
+    </w:rPr>
     <w:tblPr>
       <w:tblStyleRowBandSize w:val="1"/>
       <w:tblStyleColBandSize w:val="1"/>
@@ -4036,6 +3447,14 @@
   </w:style>
   <w:style w:type="table" w:styleId="Table2">
     <w:basedOn w:val="TableNormal"/>
+    <w:pPr>
+      <w:widowControl w:val="0"/>
+    </w:pPr>
+    <w:rPr>
+      <w:sz w:val="22"/>
+      <w:szCs w:val="22"/>
+      <w:vertAlign w:val="baseline"/>
+    </w:rPr>
     <w:tblPr>
       <w:tblStyleRowBandSize w:val="1"/>
       <w:tblStyleColBandSize w:val="1"/>
@@ -4368,19 +3787,4 @@
   </a:objectDefaults>
   <a:extraClrSchemeLst/>
 </a:theme>
-</file>
-
-<file path=customXML/item1.xml><?xml version="1.0" encoding="utf-8"?>
-<go:gDocsCustomXmlDataStorage xmlns:go="http://customooxmlschemas.google.com/" xmlns:r="http://schemas.openxmlformats.org/officeDocument/2006/relationships" uri="GoogleDocsCustomDataVersion2">
-  <go:docsCustomData xmlns:go="http://customooxmlschemas.google.com/" roundtripDataSignature="AMtx7mjGYE904+CWA34/63Fr85eUTEb3bg==">CgMxLjA4AHIhMXVidnFqUXJaLWh0UUNPZDNaeVJONTdtX19SSndRZnlB</go:docsCustomData>
-</go:gDocsCustomXmlDataStorage>
-</file>
-
-<file path=customXML/itemProps1.xml><?xml version="1.0" encoding="utf-8"?>
-<ds:datastoreItem xmlns:ds="http://schemas.openxmlformats.org/officeDocument/2006/customXml" ds:itemID="{11111111-1234-1234-1234-123412341234}">
-  <ds:schemaRefs>
-    <ds:schemaRef ds:uri="http://schemas.openxmlformats.org/officeDocument/2006/relationships"/>
-    <ds:schemaRef ds:uri="http://customooxmlschemas.google.com/"/>
-  </ds:schemaRefs>
-</ds:datastoreItem>
 </file>
</xml_diff>